<commit_message>
Update Handbook for Collecting Newspaper Endorsements.docx
</commit_message>
<xml_diff>
--- a/Project Documentation/Data Collection Process/Handbook for Collecting Newspaper Endorsements.docx
+++ b/Project Documentation/Data Collection Process/Handbook for Collecting Newspaper Endorsements.docx
@@ -320,10 +320,7 @@
     </w:p>
     <w:p>
       <w:r>
-        <w:t xml:space="preserve">The newspaper endorsements are used to estimate both relative candidate quality and newspaper partisan bias. </w:t>
-      </w:r>
-      <w:r>
-        <w:t xml:space="preserve">I update this data periodically. You can check for the most up-to-date version (and previous versions) of the data on GitHub: </w:t>
+        <w:t xml:space="preserve">The newspaper endorsements are used to estimate both relative candidate quality and newspaper partisan bias. I update this data periodically. You can check for the most up-to-date version (and previous versions) of the data on GitHub: </w:t>
       </w:r>
       <w:hyperlink r:id="rId8" w:history="1">
         <w:proofErr w:type="spellStart"/>
@@ -344,13 +341,7 @@
     </w:p>
     <w:p>
       <w:r>
-        <w:t xml:space="preserve">If you use </w:t>
-      </w:r>
-      <w:r>
-        <w:t>the quality or bias</w:t>
-      </w:r>
-      <w:r>
-        <w:t xml:space="preserve"> estimates in your research, please cite:</w:t>
+        <w:t>If you use the quality or bias estimates in your research, please cite:</w:t>
       </w:r>
     </w:p>
     <w:p>
@@ -1074,39 +1065,7 @@
           <w:sz w:val="21"/>
           <w:szCs w:val="21"/>
         </w:rPr>
-        <w:t xml:space="preserve">or, if there are multiple articles/clippings from the same day: </w:t>
-      </w:r>
-      <w:r>
-        <w:rPr>
-          <w:color w:val="0E0E0E"/>
-          <w:sz w:val="21"/>
-          <w:szCs w:val="21"/>
-        </w:rPr>
-        <w:t>101400_19821025</w:t>
-      </w:r>
-      <w:r>
-        <w:rPr>
-          <w:color w:val="0E0E0E"/>
-          <w:sz w:val="21"/>
-          <w:szCs w:val="21"/>
-        </w:rPr>
-        <w:t>_2</w:t>
-      </w:r>
-      <w:r>
-        <w:rPr>
-          <w:color w:val="0E0E0E"/>
-          <w:sz w:val="21"/>
-          <w:szCs w:val="21"/>
-        </w:rPr>
-        <w:t>.pdf</w:t>
-      </w:r>
-      <w:r>
-        <w:rPr>
-          <w:color w:val="0E0E0E"/>
-          <w:sz w:val="21"/>
-          <w:szCs w:val="21"/>
-        </w:rPr>
-        <w:t>, etc.</w:t>
+        <w:t>or, if there are multiple articles/clippings from the same day: 101400_19821025_2.pdf, etc.</w:t>
       </w:r>
     </w:p>
     <w:p>
@@ -1810,91 +1769,6 @@
           <w:right w:val="nil"/>
           <w:between w:val="nil"/>
         </w:pBdr>
-        <w:spacing w:before="180" w:after="0" w:line="240" w:lineRule="auto"/>
-        <w:rPr>
-          <w:color w:val="0E0E0E"/>
-          <w:sz w:val="21"/>
-          <w:szCs w:val="21"/>
-        </w:rPr>
-      </w:pPr>
-    </w:p>
-    <w:p>
-      <w:pPr>
-        <w:pBdr>
-          <w:top w:val="nil"/>
-          <w:left w:val="nil"/>
-          <w:bottom w:val="nil"/>
-          <w:right w:val="nil"/>
-          <w:between w:val="nil"/>
-        </w:pBdr>
-        <w:spacing w:before="180" w:after="0" w:line="240" w:lineRule="auto"/>
-        <w:rPr>
-          <w:color w:val="0E0E0E"/>
-          <w:sz w:val="21"/>
-          <w:szCs w:val="21"/>
-        </w:rPr>
-      </w:pPr>
-    </w:p>
-    <w:p>
-      <w:pPr>
-        <w:pBdr>
-          <w:top w:val="nil"/>
-          <w:left w:val="nil"/>
-          <w:bottom w:val="nil"/>
-          <w:right w:val="nil"/>
-          <w:between w:val="nil"/>
-        </w:pBdr>
-        <w:spacing w:before="180" w:after="0" w:line="240" w:lineRule="auto"/>
-        <w:rPr>
-          <w:color w:val="0E0E0E"/>
-          <w:sz w:val="21"/>
-          <w:szCs w:val="21"/>
-        </w:rPr>
-      </w:pPr>
-    </w:p>
-    <w:p>
-      <w:pPr>
-        <w:pBdr>
-          <w:top w:val="nil"/>
-          <w:left w:val="nil"/>
-          <w:bottom w:val="nil"/>
-          <w:right w:val="nil"/>
-          <w:between w:val="nil"/>
-        </w:pBdr>
-        <w:spacing w:before="180" w:after="0" w:line="240" w:lineRule="auto"/>
-        <w:rPr>
-          <w:color w:val="0E0E0E"/>
-          <w:sz w:val="21"/>
-          <w:szCs w:val="21"/>
-        </w:rPr>
-      </w:pPr>
-    </w:p>
-    <w:p>
-      <w:pPr>
-        <w:pBdr>
-          <w:top w:val="nil"/>
-          <w:left w:val="nil"/>
-          <w:bottom w:val="nil"/>
-          <w:right w:val="nil"/>
-          <w:between w:val="nil"/>
-        </w:pBdr>
-        <w:spacing w:before="180" w:after="0" w:line="240" w:lineRule="auto"/>
-        <w:rPr>
-          <w:color w:val="0E0E0E"/>
-          <w:sz w:val="21"/>
-          <w:szCs w:val="21"/>
-        </w:rPr>
-      </w:pPr>
-    </w:p>
-    <w:p>
-      <w:pPr>
-        <w:pBdr>
-          <w:top w:val="nil"/>
-          <w:left w:val="nil"/>
-          <w:bottom w:val="nil"/>
-          <w:right w:val="nil"/>
-          <w:between w:val="nil"/>
-        </w:pBdr>
         <w:spacing w:after="0" w:line="240" w:lineRule="auto"/>
         <w:rPr>
           <w:color w:val="0E0E0E"/>
@@ -2624,7 +2498,6 @@
           <w:sz w:val="21"/>
           <w:szCs w:val="21"/>
         </w:rPr>
-        <w:lastRenderedPageBreak/>
         <w:t>Notes on any missing or incomplete data. (e.g. years checked where there were no endorsements or where the archive data was missing from newspapers.com)</w:t>
       </w:r>
     </w:p>
@@ -2827,6 +2700,7 @@
           <w:sz w:val="21"/>
           <w:szCs w:val="21"/>
         </w:rPr>
+        <w:lastRenderedPageBreak/>
         <w:t>Clippings years: 1882-1928, 1933, 1936-1988, 2004, 2008-2022</w:t>
       </w:r>
     </w:p>
@@ -5693,63 +5567,7 @@
           <w:sz w:val="21"/>
           <w:szCs w:val="21"/>
         </w:rPr>
-        <w:t xml:space="preserve">.pdf, </w:t>
-      </w:r>
-      <w:r>
-        <w:rPr>
-          <w:color w:val="0E0E0E"/>
-          <w:sz w:val="21"/>
-          <w:szCs w:val="21"/>
-        </w:rPr>
-        <w:t>101400_19821025</w:t>
-      </w:r>
-      <w:r>
-        <w:rPr>
-          <w:color w:val="0E0E0E"/>
-          <w:sz w:val="21"/>
-          <w:szCs w:val="21"/>
-        </w:rPr>
-        <w:t>_1</w:t>
-      </w:r>
-      <w:r>
-        <w:rPr>
-          <w:color w:val="0E0E0E"/>
-          <w:sz w:val="21"/>
-          <w:szCs w:val="21"/>
-        </w:rPr>
-        <w:t>.pdf</w:t>
-      </w:r>
-      <w:r>
-        <w:rPr>
-          <w:color w:val="0E0E0E"/>
-          <w:sz w:val="21"/>
-          <w:szCs w:val="21"/>
-        </w:rPr>
-        <w:t xml:space="preserve"> and </w:t>
-      </w:r>
-      <w:r>
-        <w:rPr>
-          <w:color w:val="0E0E0E"/>
-          <w:sz w:val="21"/>
-          <w:szCs w:val="21"/>
-        </w:rPr>
-        <w:t>101400_19821025_</w:t>
-      </w:r>
-      <w:r>
-        <w:rPr>
-          <w:color w:val="0E0E0E"/>
-          <w:sz w:val="21"/>
-          <w:szCs w:val="21"/>
-        </w:rPr>
-        <w:t>2</w:t>
-      </w:r>
-      <w:r>
-        <w:rPr>
-          <w:color w:val="0E0E0E"/>
-          <w:sz w:val="21"/>
-          <w:szCs w:val="21"/>
-        </w:rPr>
-        <w:t>.pdf</w:t>
+        <w:t>.pdf, 101400_19821025_1.pdf and 101400_19821025_2.pdf</w:t>
       </w:r>
     </w:p>
     <w:p>
@@ -6519,37 +6337,7 @@
           <w:szCs w:val="21"/>
           <w:u w:val="single"/>
         </w:rPr>
-        <w:t>A.</w:t>
-      </w:r>
-      <w:r>
-        <w:rPr>
-          <w:i/>
-          <w:color w:val="0E0E0E"/>
-          <w:sz w:val="21"/>
-          <w:szCs w:val="21"/>
-          <w:u w:val="single"/>
-        </w:rPr>
-        <w:t>4</w:t>
-      </w:r>
-      <w:r>
-        <w:rPr>
-          <w:i/>
-          <w:color w:val="0E0E0E"/>
-          <w:sz w:val="21"/>
-          <w:szCs w:val="21"/>
-          <w:u w:val="single"/>
-        </w:rPr>
-        <w:t xml:space="preserve">    </w:t>
-      </w:r>
-      <w:r>
-        <w:rPr>
-          <w:i/>
-          <w:color w:val="0E0E0E"/>
-          <w:sz w:val="21"/>
-          <w:szCs w:val="21"/>
-          <w:u w:val="single"/>
-        </w:rPr>
-        <w:t>Folder Names</w:t>
+        <w:t>A.4    Folder Names</w:t>
       </w:r>
     </w:p>
     <w:p>
@@ -12394,6 +12182,7 @@
   <w:style w:type="character" w:default="1" w:styleId="DefaultParagraphFont">
     <w:name w:val="Default Paragraph Font"/>
     <w:uiPriority w:val="1"/>
+    <w:semiHidden/>
     <w:unhideWhenUsed/>
   </w:style>
   <w:style w:type="table" w:default="1" w:styleId="TableNormal">

</xml_diff>